<commit_message>
Dcumentación para pase :: Adecuaciones en Tokenization CMC
</commit_message>
<xml_diff>
--- a/ADECUACION_TOKENIZATION/REG-DIN-008 - 900199_Adecuciones en Tokenizacion CMC.docx
+++ b/ADECUACION_TOKENIZATION/REG-DIN-008 - 900199_Adecuciones en Tokenizacion CMC.docx
@@ -65,7 +65,7 @@
       </w:tblPr>
       <w:tblGrid>
         <w:gridCol w:w="3536"/>
-        <w:gridCol w:w="5944"/>
+        <w:gridCol w:w="5943"/>
       </w:tblGrid>
       <w:tr>
         <w:trPr>
@@ -97,29 +97,13 @@
                 <w:color w:val="000000"/>
                 <w:sz w:val="20"/>
               </w:rPr>
-              <w:t>FECHA:   1</w:t>
-            </w:r>
-            <w:r>
-              <w:rPr>
-                <w:b/>
-                <w:color w:val="000000"/>
-                <w:sz w:val="20"/>
-              </w:rPr>
-              <w:t>7</w:t>
-            </w:r>
-            <w:r>
-              <w:rPr>
-                <w:b/>
-                <w:color w:val="000000"/>
-                <w:sz w:val="20"/>
-              </w:rPr>
-              <w:t>/08/2026</w:t>
+              <w:t>FECHA:   18/08/2026</w:t>
             </w:r>
           </w:p>
         </w:tc>
         <w:tc>
           <w:tcPr>
-            <w:tcW w:w="5944" w:type="dxa"/>
+            <w:tcW w:w="5943" w:type="dxa"/>
             <w:tcBorders>
               <w:top w:val="single" w:sz="4" w:space="0" w:color="000000"/>
               <w:left w:val="single" w:sz="4" w:space="0" w:color="000000"/>
@@ -293,13 +277,13 @@
                 <w:szCs w:val="27"/>
                 <w:shd w:fill="FFFFFF" w:val="clear"/>
               </w:rPr>
-              <w:t>900241</w:t>
+              <w:t>900199</w:t>
             </w:r>
           </w:p>
         </w:tc>
         <w:tc>
           <w:tcPr>
-            <w:tcW w:w="5944" w:type="dxa"/>
+            <w:tcW w:w="5943" w:type="dxa"/>
             <w:tcBorders>
               <w:top w:val="single" w:sz="4" w:space="0" w:color="000000"/>
               <w:left w:val="single" w:sz="4" w:space="0" w:color="000000"/>
@@ -430,7 +414,7 @@
               <mc:AlternateContent>
                 <mc:Choice Requires="wps">
                   <w:drawing>
-                    <wp:anchor behindDoc="0" distT="5715" distB="5080" distL="5080" distR="5715" simplePos="0" locked="0" layoutInCell="1" allowOverlap="1" relativeHeight="6">
+                    <wp:anchor behindDoc="0" distT="5715" distB="5080" distL="5080" distR="5715" simplePos="0" locked="0" layoutInCell="1" allowOverlap="1" relativeHeight="4">
                       <wp:simplePos x="0" y="0"/>
                       <wp:positionH relativeFrom="column">
                         <wp:posOffset>3346450</wp:posOffset>
@@ -490,7 +474,7 @@
               <mc:AlternateContent>
                 <mc:Choice Requires="wps">
                   <w:drawing>
-                    <wp:anchor behindDoc="0" distT="5715" distB="5080" distL="5080" distR="5715" simplePos="0" locked="0" layoutInCell="1" allowOverlap="1" relativeHeight="7">
+                    <wp:anchor behindDoc="0" distT="5715" distB="5080" distL="5080" distR="5715" simplePos="0" locked="0" layoutInCell="1" allowOverlap="1" relativeHeight="5">
                       <wp:simplePos x="0" y="0"/>
                       <wp:positionH relativeFrom="column">
                         <wp:posOffset>1892300</wp:posOffset>
@@ -583,7 +567,7 @@
         </w:trPr>
         <w:tc>
           <w:tcPr>
-            <w:tcW w:w="9480" w:type="dxa"/>
+            <w:tcW w:w="9479" w:type="dxa"/>
             <w:gridSpan w:val="2"/>
             <w:tcBorders>
               <w:top w:val="single" w:sz="4" w:space="0" w:color="000000"/>
@@ -627,7 +611,7 @@
                 <w:color w:val="000000"/>
                 <w:sz w:val="20"/>
               </w:rPr>
-              <w:t xml:space="preserve">    900241 </w:t>
+              <w:t xml:space="preserve">    900199 </w:t>
             </w:r>
             <w:bookmarkStart w:id="0" w:name="_GoBack"/>
             <w:r>
@@ -645,7 +629,7 @@
                 <w:color w:val="000000"/>
                 <w:sz w:val="20"/>
               </w:rPr>
-              <w:t>Modificaciones en TokenizationAPI para Wallets MasterCard</w:t>
+              <w:t>Adecuaciones en Tokenizacion CMC</w:t>
             </w:r>
           </w:p>
         </w:tc>
@@ -761,39 +745,7 @@
                 <w:color w:val="000000"/>
                 <w:sz w:val="20"/>
               </w:rPr>
-              <w:t>Se crea api unificada para la obtención de tarjetas disponibles y tokenizables del cliente, encriptadas en JWE.</w:t>
-            </w:r>
-          </w:p>
-        </w:tc>
-      </w:tr>
-      <w:tr>
-        <w:trPr>
-          <w:trHeight w:val="322" w:hRule="atLeast"/>
-        </w:trPr>
-        <w:tc>
-          <w:tcPr>
-            <w:tcW w:w="9555" w:type="dxa"/>
-            <w:tcBorders>
-              <w:left w:val="single" w:sz="4" w:space="0" w:color="000000"/>
-              <w:bottom w:val="single" w:sz="4" w:space="0" w:color="000000"/>
-              <w:right w:val="single" w:sz="4" w:space="0" w:color="000000"/>
-            </w:tcBorders>
-            <w:vAlign w:val="bottom"/>
-          </w:tcPr>
-          <w:p>
-            <w:pPr>
-              <w:pStyle w:val="Normal"/>
-              <w:spacing w:before="0" w:after="0"/>
-              <w:rPr>
-                <w:color w:val="000000"/>
-                <w:sz w:val="20"/>
-              </w:rPr>
-            </w:pPr>
-            <w:r>
-              <w:rPr>
-                <w:color w:val="000000"/>
-                <w:sz w:val="20"/>
-              </w:rPr>
+              <w:t>Se realizan adecuaciones en API de LifeCycleNotification y en las APIs del proyecto TokenizationCmc para permitir los cambios de estados para todos los tokenRequestorID de ECOM y COF y mejoras en las APIS en la lógica de las APIs de CMC para tokenizacion</w:t>
             </w:r>
           </w:p>
         </w:tc>
@@ -860,7 +812,7 @@
       </w:tblPr>
       <w:tblGrid>
         <w:gridCol w:w="5770"/>
-        <w:gridCol w:w="3728"/>
+        <w:gridCol w:w="3727"/>
       </w:tblGrid>
       <w:tr>
         <w:trPr>
@@ -905,13 +857,13 @@
                 <w:szCs w:val="21"/>
                 <w:lang w:bidi="ar-SA"/>
               </w:rPr>
-              <w:t>aks-001-paycore-p</w:t>
+              <w:t>AKS-001-PAYCORE-P</w:t>
             </w:r>
           </w:p>
         </w:tc>
         <w:tc>
           <w:tcPr>
-            <w:tcW w:w="3728" w:type="dxa"/>
+            <w:tcW w:w="3727" w:type="dxa"/>
             <w:tcBorders>
               <w:top w:val="single" w:sz="4" w:space="0" w:color="000000"/>
               <w:left w:val="single" w:sz="4" w:space="0" w:color="000000"/>
@@ -1361,6 +1313,7 @@
                 <w:sz w:val="20"/>
                 <w:szCs w:val="20"/>
               </w:rPr>
+              <w:t>TokenizationCmc_BA</w:t>
             </w:r>
           </w:p>
         </w:tc>
@@ -1387,6 +1340,7 @@
                 <w:sz w:val="20"/>
                 <w:szCs w:val="20"/>
               </w:rPr>
+              <w:t>jar</w:t>
             </w:r>
           </w:p>
         </w:tc>
@@ -1496,6 +1450,7 @@
                 <w:rFonts w:cs="Arial" w:ascii="Arial" w:hAnsi="Arial"/>
                 <w:szCs w:val="20"/>
               </w:rPr>
+              <w:t>TokenizationGetCard</w:t>
             </w:r>
           </w:p>
         </w:tc>
@@ -1522,6 +1477,7 @@
                 <w:rFonts w:cs="Arial" w:ascii="Arial" w:hAnsi="Arial"/>
                 <w:szCs w:val="20"/>
               </w:rPr>
+              <w:t>jar</w:t>
             </w:r>
           </w:p>
         </w:tc>
@@ -1761,6 +1717,62 @@
               <w:t>.jar</w:t>
             </w:r>
           </w:p>
+          <w:p>
+            <w:pPr>
+              <w:pStyle w:val="ListParagraph"/>
+              <w:numPr>
+                <w:ilvl w:val="0"/>
+                <w:numId w:val="3"/>
+              </w:numPr>
+              <w:suppressAutoHyphens w:val="true"/>
+              <w:rPr>
+                <w:rFonts w:ascii="Arial" w:hAnsi="Arial" w:cs="Arial"/>
+                <w:color w:val="000000"/>
+                <w:sz w:val="20"/>
+                <w:szCs w:val="20"/>
+              </w:rPr>
+            </w:pPr>
+            <w:r>
+              <w:rPr>
+                <w:rFonts w:eastAsia="Calibri" w:cs="Arial" w:ascii="Arial" w:hAnsi="Arial"/>
+                <w:color w:val="000000"/>
+                <w:kern w:val="0"/>
+                <w:sz w:val="20"/>
+                <w:szCs w:val="20"/>
+                <w:shd w:fill="FFFFFF" w:val="clear"/>
+                <w:lang w:val="es-ES" w:eastAsia="en-US" w:bidi="ar-SA"/>
+              </w:rPr>
+              <w:t>Hacer backup del archivo TokenizationCmc_BA.jar</w:t>
+            </w:r>
+          </w:p>
+          <w:p>
+            <w:pPr>
+              <w:pStyle w:val="ListParagraph"/>
+              <w:numPr>
+                <w:ilvl w:val="0"/>
+                <w:numId w:val="3"/>
+              </w:numPr>
+              <w:suppressAutoHyphens w:val="true"/>
+              <w:rPr>
+                <w:rFonts w:ascii="Arial" w:hAnsi="Arial" w:cs="Arial"/>
+                <w:color w:val="000000"/>
+                <w:sz w:val="20"/>
+                <w:szCs w:val="20"/>
+              </w:rPr>
+            </w:pPr>
+            <w:r>
+              <w:rPr>
+                <w:rFonts w:eastAsia="Calibri" w:cs="Arial" w:ascii="Arial" w:hAnsi="Arial"/>
+                <w:color w:val="000000"/>
+                <w:kern w:val="0"/>
+                <w:sz w:val="20"/>
+                <w:szCs w:val="20"/>
+                <w:shd w:fill="FFFFFF" w:val="clear"/>
+                <w:lang w:val="es-ES" w:eastAsia="en-US" w:bidi="ar-SA"/>
+              </w:rPr>
+              <w:t>Hacer backup del archivo TokenizationGetCard.jar</w:t>
+            </w:r>
+          </w:p>
         </w:tc>
       </w:tr>
       <w:tr>
@@ -1829,7 +1841,7 @@
                 <w:shd w:fill="FFFFFF" w:val="clear"/>
                 <w:lang w:eastAsia="en-US" w:bidi="ar-SA"/>
               </w:rPr>
-              <w:t>Aprobar el pull request</w:t>
+              <w:t>Aprobar los pull request</w:t>
             </w:r>
           </w:p>
           <w:p>
@@ -1872,6 +1884,58 @@
                 <w:lang w:eastAsia="en-US" w:bidi="ar-SA"/>
               </w:rPr>
               <w:t>_CI</w:t>
+            </w:r>
+          </w:p>
+          <w:p>
+            <w:pPr>
+              <w:pStyle w:val="ListParagraph"/>
+              <w:widowControl/>
+              <w:numPr>
+                <w:ilvl w:val="0"/>
+                <w:numId w:val="3"/>
+              </w:numPr>
+              <w:suppressAutoHyphens w:val="true"/>
+              <w:bidi w:val="0"/>
+              <w:jc w:val="left"/>
+              <w:rPr/>
+            </w:pPr>
+            <w:r>
+              <w:rPr>
+                <w:rFonts w:cs="Arial" w:ascii="Arial" w:hAnsi="Arial"/>
+                <w:color w:val="000000"/>
+                <w:kern w:val="0"/>
+                <w:sz w:val="20"/>
+                <w:szCs w:val="20"/>
+                <w:shd w:fill="FFFFFF" w:val="clear"/>
+                <w:lang w:eastAsia="en-US" w:bidi="ar-SA"/>
+              </w:rPr>
+              <w:t>Ejecutar pipeline NU1110005_TokenizationCmc_TKN_INT_CI</w:t>
+            </w:r>
+          </w:p>
+          <w:p>
+            <w:pPr>
+              <w:pStyle w:val="ListParagraph"/>
+              <w:widowControl/>
+              <w:numPr>
+                <w:ilvl w:val="0"/>
+                <w:numId w:val="3"/>
+              </w:numPr>
+              <w:suppressAutoHyphens w:val="true"/>
+              <w:bidi w:val="0"/>
+              <w:jc w:val="left"/>
+              <w:rPr/>
+            </w:pPr>
+            <w:r>
+              <w:rPr>
+                <w:rFonts w:cs="Arial" w:ascii="Arial" w:hAnsi="Arial"/>
+                <w:color w:val="000000"/>
+                <w:kern w:val="0"/>
+                <w:sz w:val="20"/>
+                <w:szCs w:val="20"/>
+                <w:shd w:fill="FFFFFF" w:val="clear"/>
+                <w:lang w:eastAsia="en-US" w:bidi="ar-SA"/>
+              </w:rPr>
+              <w:t>Ejecutar pipeline NU1110008_GetAvailableTokenizationCards_TKN_INT_CI</w:t>
             </w:r>
           </w:p>
         </w:tc>
@@ -2339,7 +2403,7 @@
         <wp:inline distT="0" distB="0" distL="0" distR="0">
           <wp:extent cx="6053455" cy="733425"/>
           <wp:effectExtent l="0" t="0" r="0" b="0"/>
-          <wp:docPr id="5" name="Imagen 22 Copia 1 Copia 1 Copia 1 Copia 1 Copia 1 Copia 1 Copia 1 Copia 1 Copia 1 Copia 1 Copia 1 Copia 1 Copia 1 Copia 1" descr="cid:image004.jpg@01D74E57.C4EA2700"/>
+          <wp:docPr id="5" name="Imagen 22 Copia 1 Copia 1 Copia 1 Copia 1 Copia 1 Copia 1 Copia 1 Copia 1 Copia 1 Copia 1 Copia 1 Copia 1 Copia 1 Copia 1 Copia 1 Copia 1" descr="cid:image004.jpg@01D74E57.C4EA2700"/>
           <wp:cNvGraphicFramePr>
             <a:graphicFrameLocks xmlns:a="http://schemas.openxmlformats.org/drawingml/2006/main" noChangeAspect="1"/>
           </wp:cNvGraphicFramePr>
@@ -2347,7 +2411,7 @@
             <a:graphicData uri="http://schemas.openxmlformats.org/drawingml/2006/picture">
               <pic:pic xmlns:pic="http://schemas.openxmlformats.org/drawingml/2006/picture">
                 <pic:nvPicPr>
-                  <pic:cNvPr id="5" name="Imagen 22 Copia 1 Copia 1 Copia 1 Copia 1 Copia 1 Copia 1 Copia 1 Copia 1 Copia 1 Copia 1 Copia 1 Copia 1 Copia 1 Copia 1" descr="cid:image004.jpg@01D74E57.C4EA2700"/>
+                  <pic:cNvPr id="5" name="Imagen 22 Copia 1 Copia 1 Copia 1 Copia 1 Copia 1 Copia 1 Copia 1 Copia 1 Copia 1 Copia 1 Copia 1 Copia 1 Copia 1 Copia 1 Copia 1 Copia 1" descr="cid:image004.jpg@01D74E57.C4EA2700"/>
                   <pic:cNvPicPr>
                     <a:picLocks noChangeAspect="1" noChangeArrowheads="1"/>
                   </pic:cNvPicPr>
@@ -2391,7 +2455,7 @@
         <wp:inline distT="0" distB="0" distL="0" distR="0">
           <wp:extent cx="6053455" cy="733425"/>
           <wp:effectExtent l="0" t="0" r="0" b="0"/>
-          <wp:docPr id="6" name="Imagen 23 Copia 1 Copia 1 Copia 1 Copia 1 Copia 1 Copia 1 Copia 1 Copia 1 Copia 1 Copia 1 Copia 1 Copia 1 Copia 1 Copia 1" descr="cid:image004.jpg@01D74E57.C4EA2700"/>
+          <wp:docPr id="6" name="Imagen 23 Copia 1 Copia 1 Copia 1 Copia 1 Copia 1 Copia 1 Copia 1 Copia 1 Copia 1 Copia 1 Copia 1 Copia 1 Copia 1 Copia 1 Copia 1 Copia 1" descr="cid:image004.jpg@01D74E57.C4EA2700"/>
           <wp:cNvGraphicFramePr>
             <a:graphicFrameLocks xmlns:a="http://schemas.openxmlformats.org/drawingml/2006/main" noChangeAspect="1"/>
           </wp:cNvGraphicFramePr>
@@ -2399,7 +2463,7 @@
             <a:graphicData uri="http://schemas.openxmlformats.org/drawingml/2006/picture">
               <pic:pic xmlns:pic="http://schemas.openxmlformats.org/drawingml/2006/picture">
                 <pic:nvPicPr>
-                  <pic:cNvPr id="6" name="Imagen 23 Copia 1 Copia 1 Copia 1 Copia 1 Copia 1 Copia 1 Copia 1 Copia 1 Copia 1 Copia 1 Copia 1 Copia 1 Copia 1 Copia 1" descr="cid:image004.jpg@01D74E57.C4EA2700"/>
+                  <pic:cNvPr id="6" name="Imagen 23 Copia 1 Copia 1 Copia 1 Copia 1 Copia 1 Copia 1 Copia 1 Copia 1 Copia 1 Copia 1 Copia 1 Copia 1 Copia 1 Copia 1 Copia 1 Copia 1" descr="cid:image004.jpg@01D74E57.C4EA2700"/>
                   <pic:cNvPicPr>
                     <a:picLocks noChangeAspect="1" noChangeArrowheads="1"/>
                   </pic:cNvPicPr>
@@ -2453,7 +2517,7 @@
         <wp:inline distT="0" distB="0" distL="0" distR="0">
           <wp:extent cx="3619500" cy="732790"/>
           <wp:effectExtent l="0" t="0" r="0" b="0"/>
-          <wp:docPr id="7" name="Imagen 4 Copia 1 Copia 1 Copia 1 Copia 1 Copia 1 Copia 1 Copia 1 Copia 1 Copia 1 Copia 1 Copia 1 Copia 1 Copia 1 Copia 1" descr="cid:image004.jpg@01D74E57.C4EA2700"/>
+          <wp:docPr id="7" name="Imagen 4 Copia 1 Copia 1 Copia 1 Copia 1 Copia 1 Copia 1 Copia 1 Copia 1 Copia 1 Copia 1 Copia 1 Copia 1 Copia 1 Copia 1 Copia 1 Copia 1" descr="cid:image004.jpg@01D74E57.C4EA2700"/>
           <wp:cNvGraphicFramePr>
             <a:graphicFrameLocks xmlns:a="http://schemas.openxmlformats.org/drawingml/2006/main" noChangeAspect="1"/>
           </wp:cNvGraphicFramePr>
@@ -2461,7 +2525,7 @@
             <a:graphicData uri="http://schemas.openxmlformats.org/drawingml/2006/picture">
               <pic:pic xmlns:pic="http://schemas.openxmlformats.org/drawingml/2006/picture">
                 <pic:nvPicPr>
-                  <pic:cNvPr id="7" name="Imagen 4 Copia 1 Copia 1 Copia 1 Copia 1 Copia 1 Copia 1 Copia 1 Copia 1 Copia 1 Copia 1 Copia 1 Copia 1 Copia 1 Copia 1" descr="cid:image004.jpg@01D74E57.C4EA2700"/>
+                  <pic:cNvPr id="7" name="Imagen 4 Copia 1 Copia 1 Copia 1 Copia 1 Copia 1 Copia 1 Copia 1 Copia 1 Copia 1 Copia 1 Copia 1 Copia 1 Copia 1 Copia 1 Copia 1 Copia 1" descr="cid:image004.jpg@01D74E57.C4EA2700"/>
                   <pic:cNvPicPr>
                     <a:picLocks noChangeAspect="1" noChangeArrowheads="1"/>
                   </pic:cNvPicPr>
@@ -2504,7 +2568,7 @@
         <wp:inline distT="0" distB="0" distL="0" distR="0">
           <wp:extent cx="2434590" cy="733425"/>
           <wp:effectExtent l="0" t="0" r="0" b="0"/>
-          <wp:docPr id="8" name="Imagen 3 Copia 1 Copia 1 Copia 1 Copia 1 Copia 1 Copia 1 Copia 1 Copia 1 Copia 1 Copia 1 Copia 1 Copia 1 Copia 1 Copia 1" descr="cid:image004.jpg@01D74E57.C4EA2700"/>
+          <wp:docPr id="8" name="Imagen 3 Copia 1 Copia 1 Copia 1 Copia 1 Copia 1 Copia 1 Copia 1 Copia 1 Copia 1 Copia 1 Copia 1 Copia 1 Copia 1 Copia 1 Copia 1 Copia 1" descr="cid:image004.jpg@01D74E57.C4EA2700"/>
           <wp:cNvGraphicFramePr>
             <a:graphicFrameLocks xmlns:a="http://schemas.openxmlformats.org/drawingml/2006/main" noChangeAspect="1"/>
           </wp:cNvGraphicFramePr>
@@ -2512,7 +2576,7 @@
             <a:graphicData uri="http://schemas.openxmlformats.org/drawingml/2006/picture">
               <pic:pic xmlns:pic="http://schemas.openxmlformats.org/drawingml/2006/picture">
                 <pic:nvPicPr>
-                  <pic:cNvPr id="8" name="Imagen 3 Copia 1 Copia 1 Copia 1 Copia 1 Copia 1 Copia 1 Copia 1 Copia 1 Copia 1 Copia 1 Copia 1 Copia 1 Copia 1 Copia 1" descr="cid:image004.jpg@01D74E57.C4EA2700"/>
+                  <pic:cNvPr id="8" name="Imagen 3 Copia 1 Copia 1 Copia 1 Copia 1 Copia 1 Copia 1 Copia 1 Copia 1 Copia 1 Copia 1 Copia 1 Copia 1 Copia 1 Copia 1 Copia 1 Copia 1" descr="cid:image004.jpg@01D74E57.C4EA2700"/>
                   <pic:cNvPicPr>
                     <a:picLocks noChangeAspect="1" noChangeArrowheads="1"/>
                   </pic:cNvPicPr>
@@ -2672,6 +2736,7 @@
         </w:tabs>
         <w:ind w:left="0" w:hanging="0"/>
       </w:pPr>
+      <w:rPr/>
     </w:lvl>
     <w:lvl w:ilvl="1">
       <w:start w:val="1"/>
@@ -2685,6 +2750,7 @@
         </w:tabs>
         <w:ind w:left="0" w:hanging="0"/>
       </w:pPr>
+      <w:rPr/>
     </w:lvl>
     <w:lvl w:ilvl="2">
       <w:start w:val="1"/>
@@ -2698,6 +2764,7 @@
         </w:tabs>
         <w:ind w:left="0" w:hanging="0"/>
       </w:pPr>
+      <w:rPr/>
     </w:lvl>
     <w:lvl w:ilvl="3">
       <w:start w:val="1"/>
@@ -2711,6 +2778,7 @@
         </w:tabs>
         <w:ind w:left="0" w:hanging="0"/>
       </w:pPr>
+      <w:rPr/>
     </w:lvl>
     <w:lvl w:ilvl="4">
       <w:start w:val="1"/>
@@ -2724,6 +2792,7 @@
         </w:tabs>
         <w:ind w:left="0" w:hanging="0"/>
       </w:pPr>
+      <w:rPr/>
     </w:lvl>
     <w:lvl w:ilvl="5">
       <w:start w:val="1"/>
@@ -2737,6 +2806,7 @@
         </w:tabs>
         <w:ind w:left="0" w:hanging="0"/>
       </w:pPr>
+      <w:rPr/>
     </w:lvl>
     <w:lvl w:ilvl="6">
       <w:start w:val="1"/>
@@ -2750,6 +2820,7 @@
         </w:tabs>
         <w:ind w:left="0" w:hanging="0"/>
       </w:pPr>
+      <w:rPr/>
     </w:lvl>
     <w:lvl w:ilvl="7">
       <w:start w:val="1"/>
@@ -2763,6 +2834,7 @@
         </w:tabs>
         <w:ind w:left="0" w:hanging="0"/>
       </w:pPr>
+      <w:rPr/>
     </w:lvl>
     <w:lvl w:ilvl="8">
       <w:start w:val="1"/>
@@ -2776,6 +2848,7 @@
         </w:tabs>
         <w:ind w:left="0" w:hanging="0"/>
       </w:pPr>
+      <w:rPr/>
     </w:lvl>
   </w:abstractNum>
   <w:abstractNum w:abstractNumId="2">
@@ -3050,6 +3123,125 @@
       <w:rPr>
         <w:rFonts w:ascii="Wingdings" w:hAnsi="Wingdings" w:cs="Wingdings" w:hint="default"/>
       </w:rPr>
+    </w:lvl>
+  </w:abstractNum>
+  <w:abstractNum w:abstractNumId="4">
+    <w:lvl w:ilvl="0">
+      <w:start w:val="1"/>
+      <w:numFmt w:val="none"/>
+      <w:suff w:val="nothing"/>
+      <w:lvlText w:val=""/>
+      <w:lvlJc w:val="left"/>
+      <w:pPr>
+        <w:tabs>
+          <w:tab w:val="num" w:pos="0"/>
+        </w:tabs>
+        <w:ind w:left="0" w:hanging="0"/>
+      </w:pPr>
+    </w:lvl>
+    <w:lvl w:ilvl="1">
+      <w:start w:val="1"/>
+      <w:numFmt w:val="none"/>
+      <w:suff w:val="nothing"/>
+      <w:lvlText w:val=""/>
+      <w:lvlJc w:val="left"/>
+      <w:pPr>
+        <w:tabs>
+          <w:tab w:val="num" w:pos="0"/>
+        </w:tabs>
+        <w:ind w:left="0" w:hanging="0"/>
+      </w:pPr>
+    </w:lvl>
+    <w:lvl w:ilvl="2">
+      <w:start w:val="1"/>
+      <w:numFmt w:val="none"/>
+      <w:suff w:val="nothing"/>
+      <w:lvlText w:val=""/>
+      <w:lvlJc w:val="left"/>
+      <w:pPr>
+        <w:tabs>
+          <w:tab w:val="num" w:pos="0"/>
+        </w:tabs>
+        <w:ind w:left="0" w:hanging="0"/>
+      </w:pPr>
+    </w:lvl>
+    <w:lvl w:ilvl="3">
+      <w:start w:val="1"/>
+      <w:numFmt w:val="none"/>
+      <w:suff w:val="nothing"/>
+      <w:lvlText w:val=""/>
+      <w:lvlJc w:val="left"/>
+      <w:pPr>
+        <w:tabs>
+          <w:tab w:val="num" w:pos="0"/>
+        </w:tabs>
+        <w:ind w:left="0" w:hanging="0"/>
+      </w:pPr>
+    </w:lvl>
+    <w:lvl w:ilvl="4">
+      <w:start w:val="1"/>
+      <w:numFmt w:val="none"/>
+      <w:suff w:val="nothing"/>
+      <w:lvlText w:val=""/>
+      <w:lvlJc w:val="left"/>
+      <w:pPr>
+        <w:tabs>
+          <w:tab w:val="num" w:pos="0"/>
+        </w:tabs>
+        <w:ind w:left="0" w:hanging="0"/>
+      </w:pPr>
+    </w:lvl>
+    <w:lvl w:ilvl="5">
+      <w:start w:val="1"/>
+      <w:numFmt w:val="none"/>
+      <w:suff w:val="nothing"/>
+      <w:lvlText w:val=""/>
+      <w:lvlJc w:val="left"/>
+      <w:pPr>
+        <w:tabs>
+          <w:tab w:val="num" w:pos="0"/>
+        </w:tabs>
+        <w:ind w:left="0" w:hanging="0"/>
+      </w:pPr>
+    </w:lvl>
+    <w:lvl w:ilvl="6">
+      <w:start w:val="1"/>
+      <w:numFmt w:val="none"/>
+      <w:suff w:val="nothing"/>
+      <w:lvlText w:val=""/>
+      <w:lvlJc w:val="left"/>
+      <w:pPr>
+        <w:tabs>
+          <w:tab w:val="num" w:pos="0"/>
+        </w:tabs>
+        <w:ind w:left="0" w:hanging="0"/>
+      </w:pPr>
+    </w:lvl>
+    <w:lvl w:ilvl="7">
+      <w:start w:val="1"/>
+      <w:numFmt w:val="none"/>
+      <w:suff w:val="nothing"/>
+      <w:lvlText w:val=""/>
+      <w:lvlJc w:val="left"/>
+      <w:pPr>
+        <w:tabs>
+          <w:tab w:val="num" w:pos="0"/>
+        </w:tabs>
+        <w:ind w:left="0" w:hanging="0"/>
+      </w:pPr>
+    </w:lvl>
+    <w:lvl w:ilvl="8">
+      <w:start w:val="1"/>
+      <w:numFmt w:val="none"/>
+      <w:suff w:val="nothing"/>
+      <w:lvlText w:val=""/>
+      <w:lvlJc w:val="left"/>
+      <w:pPr>
+        <w:tabs>
+          <w:tab w:val="num" w:pos="0"/>
+        </w:tabs>
+        <w:ind w:left="0" w:hanging="0"/>
+      </w:pPr>
     </w:lvl>
   </w:abstractNum>
   <w:num w:numId="1">
@@ -3061,6 +3253,9 @@
   <w:num w:numId="3">
     <w:abstractNumId w:val="3"/>
   </w:num>
+  <w:num w:numId="4">
+    <w:abstractNumId w:val="4"/>
+  </w:num>
 </w:numbering>
 </file>
 
@@ -3085,9 +3280,7 @@
     <w:pPr>
       <w:widowControl/>
       <w:suppressAutoHyphens w:val="true"/>
-      <w:kinsoku w:val="true"/>
       <w:overflowPunct w:val="false"/>
-      <w:autoSpaceDE w:val="true"/>
       <w:bidi w:val="0"/>
       <w:spacing w:before="0" w:after="240"/>
       <w:jc w:val="left"/>
@@ -3821,9 +4014,7 @@
     <w:pPr>
       <w:widowControl/>
       <w:suppressAutoHyphens w:val="true"/>
-      <w:kinsoku w:val="true"/>
       <w:overflowPunct w:val="false"/>
-      <w:autoSpaceDE w:val="true"/>
       <w:bidi w:val="0"/>
       <w:spacing w:before="0" w:after="0"/>
       <w:jc w:val="left"/>
@@ -4008,9 +4199,7 @@
     <w:pPr>
       <w:widowControl/>
       <w:suppressAutoHyphens w:val="true"/>
-      <w:kinsoku w:val="true"/>
       <w:overflowPunct w:val="true"/>
-      <w:autoSpaceDE w:val="true"/>
       <w:bidi w:val="0"/>
       <w:spacing w:before="0" w:after="0"/>
       <w:jc w:val="left"/>

</xml_diff>